<commit_message>
new notes for kubernetes, spark, linux, networking
</commit_message>
<xml_diff>
--- a/airflow/airflow notes.docx
+++ b/airflow/airflow notes.docx
@@ -2,6 +2,243 @@
 <file path=word/document.xml><?xml version="1.0" encoding="utf-8"?>
 <w:document xmlns:wpc="http://schemas.microsoft.com/office/word/2010/wordprocessingCanvas" xmlns:cx="http://schemas.microsoft.com/office/drawing/2014/chartex" xmlns:cx1="http://schemas.microsoft.com/office/drawing/2015/9/8/chartex" xmlns:cx2="http://schemas.microsoft.com/office/drawing/2015/10/21/chartex" xmlns:cx3="http://schemas.microsoft.com/office/drawing/2016/5/9/chartex" xmlns:cx4="http://schemas.microsoft.com/office/drawing/2016/5/10/chartex" xmlns:cx5="http://schemas.microsoft.com/office/drawing/2016/5/11/chartex" xmlns:cx6="http://schemas.microsoft.com/office/drawing/2016/5/12/chartex" xmlns:cx7="http://schemas.microsoft.com/office/drawing/2016/5/13/chartex" xmlns:cx8="http://schemas.microsoft.com/office/drawing/2016/5/14/chartex" xmlns:mc="http://schemas.openxmlformats.org/markup-compatibility/2006" xmlns:aink="http://schemas.microsoft.com/office/drawing/2016/ink" xmlns:am3d="http://schemas.microsoft.com/office/drawing/2017/model3d" xmlns:o="urn:schemas-microsoft-com:office:office" xmlns:oel="http://schemas.microsoft.com/office/2019/extlst" xmlns:r="http://schemas.openxmlformats.org/officeDocument/2006/relationships" xmlns:m="http://schemas.openxmlformats.org/officeDocument/2006/math" xmlns:v="urn:schemas-microsoft-com:vml" xmlns:wp14="http://schemas.microsoft.com/office/word/2010/wordprocessingDrawing" xmlns:wp="http://schemas.openxmlformats.org/drawingml/2006/wordprocessingDrawing" xmlns:w10="urn:schemas-microsoft-com:office:word" xmlns:w="http://schemas.openxmlformats.org/wordprocessingml/2006/main" xmlns:w14="http://schemas.microsoft.com/office/word/2010/wordml" xmlns:w15="http://schemas.microsoft.com/office/word/2012/wordml" xmlns:w16cex="http://schemas.microsoft.com/office/word/2018/wordml/cex" xmlns:w16cid="http://schemas.microsoft.com/office/word/2016/wordml/cid" xmlns:w16="http://schemas.microsoft.com/office/word/2018/wordml" xmlns:w16du="http://schemas.microsoft.com/office/word/2023/wordml/word16du" xmlns:w16sdtdh="http://schemas.microsoft.com/office/word/2020/wordml/sdtdatahash" xmlns:w16sdtfl="http://schemas.microsoft.com/office/word/2024/wordml/sdtformatlock" xmlns:w16se="http://schemas.microsoft.com/office/word/2015/wordml/symex" xmlns:wpg="http://schemas.microsoft.com/office/word/2010/wordprocessingGroup" xmlns:wpi="http://schemas.microsoft.com/office/word/2010/wordprocessingInk" xmlns:wne="http://schemas.microsoft.com/office/word/2006/wordml" xmlns:wps="http://schemas.microsoft.com/office/word/2010/wordprocessingShape" mc:Ignorable="w14 w15 w16se w16cid w16 w16cex w16sdtdh w16sdtfl w16du wp14">
   <w:body>
+    <w:p>
+      <w:pPr>
+        <w:pStyle w:val="Heading1"/>
+      </w:pPr>
+      <w:r>
+        <w:t>Concepts</w:t>
+      </w:r>
+    </w:p>
+    <w:p>
+      <w:pPr>
+        <w:pStyle w:val="Heading2"/>
+      </w:pPr>
+      <w:r>
+        <w:t>Scheduler</w:t>
+      </w:r>
+    </w:p>
+    <w:p>
+      <w:r>
+        <w:t>It is a process which monitors DAG directory for changes</w:t>
+      </w:r>
+      <w:r>
+        <w:t xml:space="preserve"> (</w:t>
+      </w:r>
+      <w:r>
+        <w:t>it look at</w:t>
+      </w:r>
+      <w:r>
+        <w:t xml:space="preserve"> files</w:t>
+      </w:r>
+      <w:r>
+        <w:t xml:space="preserve"> and detects new or modified DAGs</w:t>
+      </w:r>
+      <w:r>
+        <w:t>)</w:t>
+      </w:r>
+      <w:r>
+        <w:t>, determines which tasks need to be ran</w:t>
+      </w:r>
+      <w:r>
+        <w:t xml:space="preserve"> and</w:t>
+      </w:r>
+      <w:r>
+        <w:t xml:space="preserve"> places them in queue for execution.</w:t>
+      </w:r>
+    </w:p>
+    <w:p>
+      <w:r>
+        <w:t>For example about how it works please refer to the ‘</w:t>
+      </w:r>
+      <w:r>
+        <w:t>Example workflow – Scheduler, Executor and Worker</w:t>
+      </w:r>
+      <w:r>
+        <w:t>‘ section of this documentation.</w:t>
+      </w:r>
+    </w:p>
+    <w:p>
+      <w:pPr>
+        <w:pStyle w:val="Heading2"/>
+      </w:pPr>
+      <w:r>
+        <w:t>Executor</w:t>
+      </w:r>
+    </w:p>
+    <w:p>
+      <w:r>
+        <w:t>It decides how / where to run tasks from DAGs.</w:t>
+      </w:r>
+      <w:r>
+        <w:t xml:space="preserve"> It prepares a task to be executed by a Worker. What executor is doing exactly depends on what executor we are using.</w:t>
+      </w:r>
+    </w:p>
+    <w:p>
+      <w:r>
+        <w:t>For example about how it works please refer to the ‘Example workflow – Scheduler, Executor and Worker‘ section of this documentation.</w:t>
+      </w:r>
+    </w:p>
+    <w:p>
+      <w:pPr>
+        <w:pStyle w:val="Heading2"/>
+      </w:pPr>
+      <w:r>
+        <w:t>Worker</w:t>
+      </w:r>
+    </w:p>
+    <w:p>
+      <w:r>
+        <w:t>Executes code from tasks from DAGs.</w:t>
+      </w:r>
+    </w:p>
+    <w:p>
+      <w:r>
+        <w:t>For example about how it works please refer to the ‘Example workflow – Scheduler, Executor and Worker‘ section of this documentation.</w:t>
+      </w:r>
+    </w:p>
+    <w:p>
+      <w:pPr>
+        <w:pStyle w:val="Heading2"/>
+      </w:pPr>
+      <w:r>
+        <w:t>Example workflow – Scheduler, Executor and Worker</w:t>
+      </w:r>
+    </w:p>
+    <w:p>
+      <w:r>
+        <w:t>Example workflow then Celery executor is used:</w:t>
+      </w:r>
+    </w:p>
+    <w:p>
+      <w:pPr>
+        <w:pStyle w:val="ListParagraph"/>
+        <w:numPr>
+          <w:ilvl w:val="0"/>
+          <w:numId w:val="8"/>
+        </w:numPr>
+      </w:pPr>
+      <w:r>
+        <w:t>Scheduler sees tasks’ schedules and based on that, at a proper time, it asks Executor to execute a task.</w:t>
+      </w:r>
+    </w:p>
+    <w:p>
+      <w:pPr>
+        <w:pStyle w:val="ListParagraph"/>
+        <w:numPr>
+          <w:ilvl w:val="0"/>
+          <w:numId w:val="8"/>
+        </w:numPr>
+      </w:pPr>
+      <w:r>
+        <w:t>Executor puts the task in a queue (Celery queue).</w:t>
+      </w:r>
+    </w:p>
+    <w:p>
+      <w:pPr>
+        <w:pStyle w:val="ListParagraph"/>
+        <w:numPr>
+          <w:ilvl w:val="0"/>
+          <w:numId w:val="8"/>
+        </w:numPr>
+      </w:pPr>
+      <w:r>
+        <w:t>Workers (Celery workers) sees that task in a queue and pick it up.</w:t>
+      </w:r>
+    </w:p>
+    <w:p>
+      <w:r>
+        <w:t>Example workflow then Kubernetes executor is used:</w:t>
+      </w:r>
+    </w:p>
+    <w:p>
+      <w:pPr>
+        <w:pStyle w:val="ListParagraph"/>
+        <w:numPr>
+          <w:ilvl w:val="0"/>
+          <w:numId w:val="9"/>
+        </w:numPr>
+      </w:pPr>
+      <w:r>
+        <w:t>Scheduler sees tasks’ schedules and based on that, at a proper time, it asks Executor to execute a task.</w:t>
+      </w:r>
+    </w:p>
+    <w:p>
+      <w:pPr>
+        <w:pStyle w:val="ListParagraph"/>
+        <w:numPr>
+          <w:ilvl w:val="0"/>
+          <w:numId w:val="9"/>
+        </w:numPr>
+      </w:pPr>
+      <w:r>
+        <w:t>Executor tells Kubernetes to start a Pod (Worker) for this task.</w:t>
+      </w:r>
+    </w:p>
+    <w:p>
+      <w:pPr>
+        <w:pStyle w:val="ListParagraph"/>
+        <w:numPr>
+          <w:ilvl w:val="0"/>
+          <w:numId w:val="9"/>
+        </w:numPr>
+      </w:pPr>
+      <w:r>
+        <w:t>Kubernetes creates a Pod.</w:t>
+      </w:r>
+    </w:p>
+    <w:p>
+      <w:pPr>
+        <w:pStyle w:val="ListParagraph"/>
+        <w:numPr>
+          <w:ilvl w:val="0"/>
+          <w:numId w:val="9"/>
+        </w:numPr>
+      </w:pPr>
+      <w:r>
+        <w:t>Pod runs a task.</w:t>
+      </w:r>
+    </w:p>
+    <w:p>
+      <w:pPr>
+        <w:pStyle w:val="Heading2"/>
+      </w:pPr>
+      <w:r>
+        <w:lastRenderedPageBreak/>
+        <w:t>Web server</w:t>
+      </w:r>
+    </w:p>
+    <w:p>
+      <w:r>
+        <w:t>Provides a web application for monitoring DAGs and performing different actions on them (starting, stopping).</w:t>
+      </w:r>
+    </w:p>
+    <w:p>
+      <w:pPr>
+        <w:pStyle w:val="Heading2"/>
+      </w:pPr>
+      <w:r>
+        <w:t>Metadata database</w:t>
+      </w:r>
+    </w:p>
+    <w:p>
+      <w:r>
+        <w:t>Database (usually PostgreSQL) with information about DAGs, tasks, job statuses etc.</w:t>
+      </w:r>
+    </w:p>
+    <w:p>
+      <w:pPr>
+        <w:pStyle w:val="Heading2"/>
+      </w:pPr>
+      <w:r>
+        <w:t>DAGs</w:t>
+      </w:r>
+    </w:p>
+    <w:p>
+      <w:r>
+        <w:t>DAGs are written in Python and they define workflows, that is what tasks will be executed in which order.</w:t>
+      </w:r>
+    </w:p>
     <w:p>
       <w:pPr>
         <w:pStyle w:val="Heading1"/>
@@ -72,19 +309,7 @@
         </w:numPr>
       </w:pPr>
       <w:r>
-        <w:t xml:space="preserve">Docker / Kubernetes serverless services (like Azure Container Instances or Azure Kubernetes Service) </w:t>
-      </w:r>
-    </w:p>
-    <w:p>
-      <w:pPr>
-        <w:pStyle w:val="ListParagraph"/>
-        <w:numPr>
-          <w:ilvl w:val="0"/>
-          <w:numId w:val="1"/>
-        </w:numPr>
-      </w:pPr>
-      <w:r>
-        <w:t>VM</w:t>
+        <w:t>Docker / Kubernetes</w:t>
       </w:r>
     </w:p>
     <w:p>
@@ -181,6 +406,7 @@
         </w:numPr>
       </w:pPr>
       <w:r>
+        <w:lastRenderedPageBreak/>
         <w:t>Astronomer</w:t>
       </w:r>
     </w:p>
@@ -827,6 +1053,119 @@
     </w:lvl>
   </w:abstractNum>
   <w:abstractNum w:abstractNumId="4" w15:restartNumberingAfterBreak="0">
+    <w:nsid w:val="4E652B91"/>
+    <w:multiLevelType w:val="hybridMultilevel"/>
+    <w:tmpl w:val="13AC058C"/>
+    <w:lvl w:ilvl="0" w:tplc="04090001">
+      <w:start w:val="1"/>
+      <w:numFmt w:val="bullet"/>
+      <w:lvlText w:val=""/>
+      <w:lvlJc w:val="left"/>
+      <w:pPr>
+        <w:ind w:left="720" w:hanging="360"/>
+      </w:pPr>
+      <w:rPr>
+        <w:rFonts w:ascii="Symbol" w:hAnsi="Symbol" w:hint="default"/>
+      </w:rPr>
+    </w:lvl>
+    <w:lvl w:ilvl="1" w:tplc="04090003" w:tentative="1">
+      <w:start w:val="1"/>
+      <w:numFmt w:val="bullet"/>
+      <w:lvlText w:val="o"/>
+      <w:lvlJc w:val="left"/>
+      <w:pPr>
+        <w:ind w:left="1440" w:hanging="360"/>
+      </w:pPr>
+      <w:rPr>
+        <w:rFonts w:ascii="Courier New" w:hAnsi="Courier New" w:cs="Courier New" w:hint="default"/>
+      </w:rPr>
+    </w:lvl>
+    <w:lvl w:ilvl="2" w:tplc="04090005" w:tentative="1">
+      <w:start w:val="1"/>
+      <w:numFmt w:val="bullet"/>
+      <w:lvlText w:val=""/>
+      <w:lvlJc w:val="left"/>
+      <w:pPr>
+        <w:ind w:left="2160" w:hanging="360"/>
+      </w:pPr>
+      <w:rPr>
+        <w:rFonts w:ascii="Wingdings" w:hAnsi="Wingdings" w:hint="default"/>
+      </w:rPr>
+    </w:lvl>
+    <w:lvl w:ilvl="3" w:tplc="04090001" w:tentative="1">
+      <w:start w:val="1"/>
+      <w:numFmt w:val="bullet"/>
+      <w:lvlText w:val=""/>
+      <w:lvlJc w:val="left"/>
+      <w:pPr>
+        <w:ind w:left="2880" w:hanging="360"/>
+      </w:pPr>
+      <w:rPr>
+        <w:rFonts w:ascii="Symbol" w:hAnsi="Symbol" w:hint="default"/>
+      </w:rPr>
+    </w:lvl>
+    <w:lvl w:ilvl="4" w:tplc="04090003" w:tentative="1">
+      <w:start w:val="1"/>
+      <w:numFmt w:val="bullet"/>
+      <w:lvlText w:val="o"/>
+      <w:lvlJc w:val="left"/>
+      <w:pPr>
+        <w:ind w:left="3600" w:hanging="360"/>
+      </w:pPr>
+      <w:rPr>
+        <w:rFonts w:ascii="Courier New" w:hAnsi="Courier New" w:cs="Courier New" w:hint="default"/>
+      </w:rPr>
+    </w:lvl>
+    <w:lvl w:ilvl="5" w:tplc="04090005" w:tentative="1">
+      <w:start w:val="1"/>
+      <w:numFmt w:val="bullet"/>
+      <w:lvlText w:val=""/>
+      <w:lvlJc w:val="left"/>
+      <w:pPr>
+        <w:ind w:left="4320" w:hanging="360"/>
+      </w:pPr>
+      <w:rPr>
+        <w:rFonts w:ascii="Wingdings" w:hAnsi="Wingdings" w:hint="default"/>
+      </w:rPr>
+    </w:lvl>
+    <w:lvl w:ilvl="6" w:tplc="04090001" w:tentative="1">
+      <w:start w:val="1"/>
+      <w:numFmt w:val="bullet"/>
+      <w:lvlText w:val=""/>
+      <w:lvlJc w:val="left"/>
+      <w:pPr>
+        <w:ind w:left="5040" w:hanging="360"/>
+      </w:pPr>
+      <w:rPr>
+        <w:rFonts w:ascii="Symbol" w:hAnsi="Symbol" w:hint="default"/>
+      </w:rPr>
+    </w:lvl>
+    <w:lvl w:ilvl="7" w:tplc="04090003" w:tentative="1">
+      <w:start w:val="1"/>
+      <w:numFmt w:val="bullet"/>
+      <w:lvlText w:val="o"/>
+      <w:lvlJc w:val="left"/>
+      <w:pPr>
+        <w:ind w:left="5760" w:hanging="360"/>
+      </w:pPr>
+      <w:rPr>
+        <w:rFonts w:ascii="Courier New" w:hAnsi="Courier New" w:cs="Courier New" w:hint="default"/>
+      </w:rPr>
+    </w:lvl>
+    <w:lvl w:ilvl="8" w:tplc="04090005" w:tentative="1">
+      <w:start w:val="1"/>
+      <w:numFmt w:val="bullet"/>
+      <w:lvlText w:val=""/>
+      <w:lvlJc w:val="left"/>
+      <w:pPr>
+        <w:ind w:left="6480" w:hanging="360"/>
+      </w:pPr>
+      <w:rPr>
+        <w:rFonts w:ascii="Wingdings" w:hAnsi="Wingdings" w:hint="default"/>
+      </w:rPr>
+    </w:lvl>
+  </w:abstractNum>
+  <w:abstractNum w:abstractNumId="5" w15:restartNumberingAfterBreak="0">
     <w:nsid w:val="526358AA"/>
     <w:multiLevelType w:val="hybridMultilevel"/>
     <w:tmpl w:val="99805DD6"/>
@@ -966,7 +1305,7 @@
       </w:rPr>
     </w:lvl>
   </w:abstractNum>
-  <w:abstractNum w:abstractNumId="5" w15:restartNumberingAfterBreak="0">
+  <w:abstractNum w:abstractNumId="6" w15:restartNumberingAfterBreak="0">
     <w:nsid w:val="54A807D8"/>
     <w:multiLevelType w:val="multilevel"/>
     <w:tmpl w:val="2F1E1504"/>
@@ -1112,6 +1451,232 @@
       <w:rPr>
         <w:rFonts w:ascii="Symbol" w:hAnsi="Symbol" w:hint="default"/>
         <w:sz w:val="20"/>
+      </w:rPr>
+    </w:lvl>
+  </w:abstractNum>
+  <w:abstractNum w:abstractNumId="7" w15:restartNumberingAfterBreak="0">
+    <w:nsid w:val="620D4D17"/>
+    <w:multiLevelType w:val="hybridMultilevel"/>
+    <w:tmpl w:val="6F5C92C8"/>
+    <w:lvl w:ilvl="0" w:tplc="04090001">
+      <w:start w:val="1"/>
+      <w:numFmt w:val="bullet"/>
+      <w:lvlText w:val=""/>
+      <w:lvlJc w:val="left"/>
+      <w:pPr>
+        <w:ind w:left="720" w:hanging="360"/>
+      </w:pPr>
+      <w:rPr>
+        <w:rFonts w:ascii="Symbol" w:hAnsi="Symbol" w:hint="default"/>
+      </w:rPr>
+    </w:lvl>
+    <w:lvl w:ilvl="1" w:tplc="04090003" w:tentative="1">
+      <w:start w:val="1"/>
+      <w:numFmt w:val="bullet"/>
+      <w:lvlText w:val="o"/>
+      <w:lvlJc w:val="left"/>
+      <w:pPr>
+        <w:ind w:left="1440" w:hanging="360"/>
+      </w:pPr>
+      <w:rPr>
+        <w:rFonts w:ascii="Courier New" w:hAnsi="Courier New" w:cs="Courier New" w:hint="default"/>
+      </w:rPr>
+    </w:lvl>
+    <w:lvl w:ilvl="2" w:tplc="04090005" w:tentative="1">
+      <w:start w:val="1"/>
+      <w:numFmt w:val="bullet"/>
+      <w:lvlText w:val=""/>
+      <w:lvlJc w:val="left"/>
+      <w:pPr>
+        <w:ind w:left="2160" w:hanging="360"/>
+      </w:pPr>
+      <w:rPr>
+        <w:rFonts w:ascii="Wingdings" w:hAnsi="Wingdings" w:hint="default"/>
+      </w:rPr>
+    </w:lvl>
+    <w:lvl w:ilvl="3" w:tplc="04090001" w:tentative="1">
+      <w:start w:val="1"/>
+      <w:numFmt w:val="bullet"/>
+      <w:lvlText w:val=""/>
+      <w:lvlJc w:val="left"/>
+      <w:pPr>
+        <w:ind w:left="2880" w:hanging="360"/>
+      </w:pPr>
+      <w:rPr>
+        <w:rFonts w:ascii="Symbol" w:hAnsi="Symbol" w:hint="default"/>
+      </w:rPr>
+    </w:lvl>
+    <w:lvl w:ilvl="4" w:tplc="04090003" w:tentative="1">
+      <w:start w:val="1"/>
+      <w:numFmt w:val="bullet"/>
+      <w:lvlText w:val="o"/>
+      <w:lvlJc w:val="left"/>
+      <w:pPr>
+        <w:ind w:left="3600" w:hanging="360"/>
+      </w:pPr>
+      <w:rPr>
+        <w:rFonts w:ascii="Courier New" w:hAnsi="Courier New" w:cs="Courier New" w:hint="default"/>
+      </w:rPr>
+    </w:lvl>
+    <w:lvl w:ilvl="5" w:tplc="04090005" w:tentative="1">
+      <w:start w:val="1"/>
+      <w:numFmt w:val="bullet"/>
+      <w:lvlText w:val=""/>
+      <w:lvlJc w:val="left"/>
+      <w:pPr>
+        <w:ind w:left="4320" w:hanging="360"/>
+      </w:pPr>
+      <w:rPr>
+        <w:rFonts w:ascii="Wingdings" w:hAnsi="Wingdings" w:hint="default"/>
+      </w:rPr>
+    </w:lvl>
+    <w:lvl w:ilvl="6" w:tplc="04090001" w:tentative="1">
+      <w:start w:val="1"/>
+      <w:numFmt w:val="bullet"/>
+      <w:lvlText w:val=""/>
+      <w:lvlJc w:val="left"/>
+      <w:pPr>
+        <w:ind w:left="5040" w:hanging="360"/>
+      </w:pPr>
+      <w:rPr>
+        <w:rFonts w:ascii="Symbol" w:hAnsi="Symbol" w:hint="default"/>
+      </w:rPr>
+    </w:lvl>
+    <w:lvl w:ilvl="7" w:tplc="04090003" w:tentative="1">
+      <w:start w:val="1"/>
+      <w:numFmt w:val="bullet"/>
+      <w:lvlText w:val="o"/>
+      <w:lvlJc w:val="left"/>
+      <w:pPr>
+        <w:ind w:left="5760" w:hanging="360"/>
+      </w:pPr>
+      <w:rPr>
+        <w:rFonts w:ascii="Courier New" w:hAnsi="Courier New" w:cs="Courier New" w:hint="default"/>
+      </w:rPr>
+    </w:lvl>
+    <w:lvl w:ilvl="8" w:tplc="04090005" w:tentative="1">
+      <w:start w:val="1"/>
+      <w:numFmt w:val="bullet"/>
+      <w:lvlText w:val=""/>
+      <w:lvlJc w:val="left"/>
+      <w:pPr>
+        <w:ind w:left="6480" w:hanging="360"/>
+      </w:pPr>
+      <w:rPr>
+        <w:rFonts w:ascii="Wingdings" w:hAnsi="Wingdings" w:hint="default"/>
+      </w:rPr>
+    </w:lvl>
+  </w:abstractNum>
+  <w:abstractNum w:abstractNumId="8" w15:restartNumberingAfterBreak="0">
+    <w:nsid w:val="72C83BDB"/>
+    <w:multiLevelType w:val="hybridMultilevel"/>
+    <w:tmpl w:val="E242BEE2"/>
+    <w:lvl w:ilvl="0" w:tplc="04090001">
+      <w:start w:val="1"/>
+      <w:numFmt w:val="bullet"/>
+      <w:lvlText w:val=""/>
+      <w:lvlJc w:val="left"/>
+      <w:pPr>
+        <w:ind w:left="720" w:hanging="360"/>
+      </w:pPr>
+      <w:rPr>
+        <w:rFonts w:ascii="Symbol" w:hAnsi="Symbol" w:hint="default"/>
+      </w:rPr>
+    </w:lvl>
+    <w:lvl w:ilvl="1" w:tplc="04090003" w:tentative="1">
+      <w:start w:val="1"/>
+      <w:numFmt w:val="bullet"/>
+      <w:lvlText w:val="o"/>
+      <w:lvlJc w:val="left"/>
+      <w:pPr>
+        <w:ind w:left="1440" w:hanging="360"/>
+      </w:pPr>
+      <w:rPr>
+        <w:rFonts w:ascii="Courier New" w:hAnsi="Courier New" w:cs="Courier New" w:hint="default"/>
+      </w:rPr>
+    </w:lvl>
+    <w:lvl w:ilvl="2" w:tplc="04090005" w:tentative="1">
+      <w:start w:val="1"/>
+      <w:numFmt w:val="bullet"/>
+      <w:lvlText w:val=""/>
+      <w:lvlJc w:val="left"/>
+      <w:pPr>
+        <w:ind w:left="2160" w:hanging="360"/>
+      </w:pPr>
+      <w:rPr>
+        <w:rFonts w:ascii="Wingdings" w:hAnsi="Wingdings" w:hint="default"/>
+      </w:rPr>
+    </w:lvl>
+    <w:lvl w:ilvl="3" w:tplc="04090001" w:tentative="1">
+      <w:start w:val="1"/>
+      <w:numFmt w:val="bullet"/>
+      <w:lvlText w:val=""/>
+      <w:lvlJc w:val="left"/>
+      <w:pPr>
+        <w:ind w:left="2880" w:hanging="360"/>
+      </w:pPr>
+      <w:rPr>
+        <w:rFonts w:ascii="Symbol" w:hAnsi="Symbol" w:hint="default"/>
+      </w:rPr>
+    </w:lvl>
+    <w:lvl w:ilvl="4" w:tplc="04090003" w:tentative="1">
+      <w:start w:val="1"/>
+      <w:numFmt w:val="bullet"/>
+      <w:lvlText w:val="o"/>
+      <w:lvlJc w:val="left"/>
+      <w:pPr>
+        <w:ind w:left="3600" w:hanging="360"/>
+      </w:pPr>
+      <w:rPr>
+        <w:rFonts w:ascii="Courier New" w:hAnsi="Courier New" w:cs="Courier New" w:hint="default"/>
+      </w:rPr>
+    </w:lvl>
+    <w:lvl w:ilvl="5" w:tplc="04090005" w:tentative="1">
+      <w:start w:val="1"/>
+      <w:numFmt w:val="bullet"/>
+      <w:lvlText w:val=""/>
+      <w:lvlJc w:val="left"/>
+      <w:pPr>
+        <w:ind w:left="4320" w:hanging="360"/>
+      </w:pPr>
+      <w:rPr>
+        <w:rFonts w:ascii="Wingdings" w:hAnsi="Wingdings" w:hint="default"/>
+      </w:rPr>
+    </w:lvl>
+    <w:lvl w:ilvl="6" w:tplc="04090001" w:tentative="1">
+      <w:start w:val="1"/>
+      <w:numFmt w:val="bullet"/>
+      <w:lvlText w:val=""/>
+      <w:lvlJc w:val="left"/>
+      <w:pPr>
+        <w:ind w:left="5040" w:hanging="360"/>
+      </w:pPr>
+      <w:rPr>
+        <w:rFonts w:ascii="Symbol" w:hAnsi="Symbol" w:hint="default"/>
+      </w:rPr>
+    </w:lvl>
+    <w:lvl w:ilvl="7" w:tplc="04090003" w:tentative="1">
+      <w:start w:val="1"/>
+      <w:numFmt w:val="bullet"/>
+      <w:lvlText w:val="o"/>
+      <w:lvlJc w:val="left"/>
+      <w:pPr>
+        <w:ind w:left="5760" w:hanging="360"/>
+      </w:pPr>
+      <w:rPr>
+        <w:rFonts w:ascii="Courier New" w:hAnsi="Courier New" w:cs="Courier New" w:hint="default"/>
+      </w:rPr>
+    </w:lvl>
+    <w:lvl w:ilvl="8" w:tplc="04090005" w:tentative="1">
+      <w:start w:val="1"/>
+      <w:numFmt w:val="bullet"/>
+      <w:lvlText w:val=""/>
+      <w:lvlJc w:val="left"/>
+      <w:pPr>
+        <w:ind w:left="6480" w:hanging="360"/>
+      </w:pPr>
+      <w:rPr>
+        <w:rFonts w:ascii="Wingdings" w:hAnsi="Wingdings" w:hint="default"/>
       </w:rPr>
     </w:lvl>
   </w:abstractNum>
@@ -1125,13 +1690,22 @@
     <w:abstractNumId w:val="2"/>
   </w:num>
   <w:num w:numId="4" w16cid:durableId="1107701139">
-    <w:abstractNumId w:val="5"/>
+    <w:abstractNumId w:val="6"/>
   </w:num>
   <w:num w:numId="5" w16cid:durableId="1541822218">
-    <w:abstractNumId w:val="4"/>
+    <w:abstractNumId w:val="5"/>
   </w:num>
   <w:num w:numId="6" w16cid:durableId="359820498">
     <w:abstractNumId w:val="0"/>
+  </w:num>
+  <w:num w:numId="7" w16cid:durableId="812525626">
+    <w:abstractNumId w:val="7"/>
+  </w:num>
+  <w:num w:numId="8" w16cid:durableId="1564364394">
+    <w:abstractNumId w:val="8"/>
+  </w:num>
+  <w:num w:numId="9" w16cid:durableId="1777865000">
+    <w:abstractNumId w:val="4"/>
   </w:num>
 </w:numbering>
 </file>
@@ -1738,6 +2312,7 @@
   <w:style w:type="character" w:default="1" w:styleId="DefaultParagraphFont">
     <w:name w:val="Default Paragraph Font"/>
     <w:uiPriority w:val="1"/>
+    <w:semiHidden/>
     <w:unhideWhenUsed/>
   </w:style>
   <w:style w:type="table" w:default="1" w:styleId="TableNormal">

</xml_diff>